<commit_message>
Fix mistakes in invoice generator documents
</commit_message>
<xml_diff>
--- a/ENIGMAS/INVOICE_GENERATOR/Required_Doc/Automatic Invoice Generator.docx
+++ b/ENIGMAS/INVOICE_GENERATOR/Required_Doc/Automatic Invoice Generator.docx
@@ -9815,21 +9815,35 @@
         <w:rPr>
           <w:noProof/>
         </w:rPr>
+        <w:t xml:space="preserve">   </w:t>
+      </w:r>
+      <w:r>
+        <w:rPr>
+          <w:noProof/>
+        </w:rPr>
         <w:drawing>
-          <wp:inline distT="0" distB="0" distL="0" distR="0" wp14:anchorId="1858A08D" wp14:editId="1B13F574">
-            <wp:extent cx="7105015" cy="5044186"/>
-            <wp:effectExtent l="0" t="0" r="0" b="0"/>
-            <wp:docPr id="1386" name="Picture 1386"/>
-            <wp:cNvGraphicFramePr/>
+          <wp:inline distT="0" distB="0" distL="0" distR="0" wp14:anchorId="1369A01D" wp14:editId="2963C46B">
+            <wp:extent cx="6546215" cy="5701145"/>
+            <wp:effectExtent l="0" t="0" r="6985" b="0"/>
+            <wp:docPr id="795997598" name="Picture 115"/>
+            <wp:cNvGraphicFramePr>
+              <a:graphicFrameLocks xmlns:a="http://schemas.openxmlformats.org/drawingml/2006/main" noChangeAspect="1"/>
+            </wp:cNvGraphicFramePr>
             <a:graphic xmlns:a="http://schemas.openxmlformats.org/drawingml/2006/main">
               <a:graphicData uri="http://schemas.openxmlformats.org/drawingml/2006/picture">
                 <pic:pic xmlns:pic="http://schemas.openxmlformats.org/drawingml/2006/picture">
                   <pic:nvPicPr>
-                    <pic:cNvPr id="1386" name="Picture 1386"/>
+                    <pic:cNvPr id="795997598" name="Picture 795997598"/>
                     <pic:cNvPicPr/>
                   </pic:nvPicPr>
                   <pic:blipFill>
-                    <a:blip r:embed="rId8"/>
+                    <a:blip r:embed="rId8">
+                      <a:extLst>
+                        <a:ext uri="{28A0092B-C50C-407E-A947-70E740481C1C}">
+                          <a14:useLocalDpi xmlns:a14="http://schemas.microsoft.com/office/drawing/2010/main" val="0"/>
+                        </a:ext>
+                      </a:extLst>
+                    </a:blip>
                     <a:stretch>
                       <a:fillRect/>
                     </a:stretch>
@@ -9837,7 +9851,7 @@
                   <pic:spPr>
                     <a:xfrm>
                       <a:off x="0" y="0"/>
-                      <a:ext cx="7105015" cy="5044186"/>
+                      <a:ext cx="6557356" cy="5710848"/>
                     </a:xfrm>
                     <a:prstGeom prst="rect">
                       <a:avLst/>

</xml_diff>

<commit_message>
Update invoice generator documentation files
</commit_message>
<xml_diff>
--- a/ENIGMAS/INVOICE_GENERATOR/Required_Doc/Automatic Invoice Generator.docx
+++ b/ENIGMAS/INVOICE_GENERATOR/Required_Doc/Automatic Invoice Generator.docx
@@ -9786,46 +9786,25 @@
           <w:ilvl w:val="0"/>
           <w:numId w:val="0"/>
         </w:numPr>
-        <w:spacing w:after="23"/>
-        <w:ind w:left="-5"/>
-      </w:pPr>
-      <w:r>
-        <w:t xml:space="preserve">12.Task Distribution </w:t>
-      </w:r>
-    </w:p>
-    <w:p>
-      <w:pPr>
-        <w:spacing w:after="0" w:line="259" w:lineRule="auto"/>
-        <w:ind w:left="0" w:firstLine="0"/>
-      </w:pPr>
-      <w:r>
-        <w:rPr>
-          <w:b/>
-          <w:sz w:val="32"/>
-        </w:rPr>
-        <w:t xml:space="preserve"> </w:t>
-      </w:r>
-    </w:p>
-    <w:p>
-      <w:pPr>
-        <w:spacing w:after="0" w:line="259" w:lineRule="auto"/>
-        <w:ind w:left="-1082" w:right="-1008" w:firstLine="0"/>
-      </w:pPr>
-      <w:r>
-        <w:rPr>
-          <w:noProof/>
-        </w:rPr>
-        <w:t xml:space="preserve">   </w:t>
-      </w:r>
+        <w:ind w:left="10" w:hanging="10"/>
+      </w:pPr>
       <w:r>
         <w:rPr>
           <w:noProof/>
         </w:rPr>
         <w:drawing>
-          <wp:inline distT="0" distB="0" distL="0" distR="0" wp14:anchorId="1369A01D" wp14:editId="2963C46B">
-            <wp:extent cx="6546215" cy="5701145"/>
-            <wp:effectExtent l="0" t="0" r="6985" b="0"/>
-            <wp:docPr id="795997598" name="Picture 115"/>
+          <wp:anchor distT="0" distB="0" distL="114300" distR="114300" simplePos="0" relativeHeight="251658240" behindDoc="0" locked="0" layoutInCell="1" allowOverlap="1" wp14:anchorId="67AAE298" wp14:editId="253DB9BF">
+            <wp:simplePos x="0" y="0"/>
+            <wp:positionH relativeFrom="margin">
+              <wp:align>center</wp:align>
+            </wp:positionH>
+            <wp:positionV relativeFrom="paragraph">
+              <wp:posOffset>270568</wp:posOffset>
+            </wp:positionV>
+            <wp:extent cx="6885709" cy="5774007"/>
+            <wp:effectExtent l="0" t="0" r="0" b="0"/>
+            <wp:wrapNone/>
+            <wp:docPr id="706747541" name="Picture 115"/>
             <wp:cNvGraphicFramePr>
               <a:graphicFrameLocks xmlns:a="http://schemas.openxmlformats.org/drawingml/2006/main" noChangeAspect="1"/>
             </wp:cNvGraphicFramePr>
@@ -9833,11 +9812,11 @@
               <a:graphicData uri="http://schemas.openxmlformats.org/drawingml/2006/picture">
                 <pic:pic xmlns:pic="http://schemas.openxmlformats.org/drawingml/2006/picture">
                   <pic:nvPicPr>
-                    <pic:cNvPr id="795997598" name="Picture 795997598"/>
+                    <pic:cNvPr id="706747541" name="Picture 706747541"/>
                     <pic:cNvPicPr/>
                   </pic:nvPicPr>
                   <pic:blipFill>
-                    <a:blip r:embed="rId8">
+                    <a:blip r:embed="rId8" cstate="print">
                       <a:extLst>
                         <a:ext uri="{28A0092B-C50C-407E-A947-70E740481C1C}">
                           <a14:useLocalDpi xmlns:a14="http://schemas.microsoft.com/office/drawing/2010/main" val="0"/>
@@ -9851,7 +9830,254 @@
                   <pic:spPr>
                     <a:xfrm>
                       <a:off x="0" y="0"/>
-                      <a:ext cx="6557356" cy="5710848"/>
+                      <a:ext cx="6885709" cy="5774007"/>
+                    </a:xfrm>
+                    <a:prstGeom prst="rect">
+                      <a:avLst/>
+                    </a:prstGeom>
+                  </pic:spPr>
+                </pic:pic>
+              </a:graphicData>
+            </a:graphic>
+            <wp14:sizeRelH relativeFrom="page">
+              <wp14:pctWidth>0</wp14:pctWidth>
+            </wp14:sizeRelH>
+            <wp14:sizeRelV relativeFrom="page">
+              <wp14:pctHeight>0</wp14:pctHeight>
+            </wp14:sizeRelV>
+          </wp:anchor>
+        </w:drawing>
+      </w:r>
+      <w:r>
+        <w:t>12.</w:t>
+      </w:r>
+      <w:r>
+        <w:t>T</w:t>
+      </w:r>
+      <w:r>
+        <w:t>able</w:t>
+      </w:r>
+      <w:r>
+        <w:t xml:space="preserve"> Information</w:t>
+      </w:r>
+    </w:p>
+    <w:p>
+      <w:pPr>
+        <w:spacing w:after="160" w:line="278" w:lineRule="auto"/>
+        <w:ind w:left="0" w:firstLine="0"/>
+        <w:rPr>
+          <w:b/>
+          <w:sz w:val="32"/>
+        </w:rPr>
+      </w:pPr>
+      <w:r>
+        <w:br w:type="page"/>
+      </w:r>
+    </w:p>
+    <w:p>
+      <w:pPr>
+        <w:pStyle w:val="Heading1"/>
+        <w:numPr>
+          <w:ilvl w:val="0"/>
+          <w:numId w:val="0"/>
+        </w:numPr>
+        <w:spacing w:after="23"/>
+        <w:ind w:left="-5"/>
+      </w:pPr>
+      <w:r>
+        <w:rPr>
+          <w:noProof/>
+        </w:rPr>
+        <w:lastRenderedPageBreak/>
+        <w:drawing>
+          <wp:anchor distT="0" distB="0" distL="114300" distR="114300" simplePos="0" relativeHeight="251659264" behindDoc="0" locked="0" layoutInCell="1" allowOverlap="1" wp14:anchorId="1D7C8DD4" wp14:editId="100B842E">
+            <wp:simplePos x="0" y="0"/>
+            <wp:positionH relativeFrom="column">
+              <wp:posOffset>-436418</wp:posOffset>
+            </wp:positionH>
+            <wp:positionV relativeFrom="paragraph">
+              <wp:posOffset>-3176</wp:posOffset>
+            </wp:positionV>
+            <wp:extent cx="6691630" cy="5153891"/>
+            <wp:effectExtent l="0" t="0" r="0" b="8890"/>
+            <wp:wrapNone/>
+            <wp:docPr id="447644135" name="Picture 117"/>
+            <wp:cNvGraphicFramePr>
+              <a:graphicFrameLocks xmlns:a="http://schemas.openxmlformats.org/drawingml/2006/main" noChangeAspect="1"/>
+            </wp:cNvGraphicFramePr>
+            <a:graphic xmlns:a="http://schemas.openxmlformats.org/drawingml/2006/main">
+              <a:graphicData uri="http://schemas.openxmlformats.org/drawingml/2006/picture">
+                <pic:pic xmlns:pic="http://schemas.openxmlformats.org/drawingml/2006/picture">
+                  <pic:nvPicPr>
+                    <pic:cNvPr id="447644135" name="Picture 447644135"/>
+                    <pic:cNvPicPr/>
+                  </pic:nvPicPr>
+                  <pic:blipFill>
+                    <a:blip r:embed="rId9" cstate="print">
+                      <a:extLst>
+                        <a:ext uri="{28A0092B-C50C-407E-A947-70E740481C1C}">
+                          <a14:useLocalDpi xmlns:a14="http://schemas.microsoft.com/office/drawing/2010/main" val="0"/>
+                        </a:ext>
+                      </a:extLst>
+                    </a:blip>
+                    <a:stretch>
+                      <a:fillRect/>
+                    </a:stretch>
+                  </pic:blipFill>
+                  <pic:spPr>
+                    <a:xfrm>
+                      <a:off x="0" y="0"/>
+                      <a:ext cx="6718394" cy="5174505"/>
+                    </a:xfrm>
+                    <a:prstGeom prst="rect">
+                      <a:avLst/>
+                    </a:prstGeom>
+                  </pic:spPr>
+                </pic:pic>
+              </a:graphicData>
+            </a:graphic>
+            <wp14:sizeRelH relativeFrom="page">
+              <wp14:pctWidth>0</wp14:pctWidth>
+            </wp14:sizeRelH>
+            <wp14:sizeRelV relativeFrom="page">
+              <wp14:pctHeight>0</wp14:pctHeight>
+            </wp14:sizeRelV>
+          </wp:anchor>
+        </w:drawing>
+      </w:r>
+    </w:p>
+    <w:p>
+      <w:pPr>
+        <w:pStyle w:val="Heading1"/>
+        <w:numPr>
+          <w:ilvl w:val="0"/>
+          <w:numId w:val="0"/>
+        </w:numPr>
+        <w:spacing w:after="23"/>
+        <w:ind w:left="-5"/>
+      </w:pPr>
+    </w:p>
+    <w:p>
+      <w:pPr>
+        <w:pStyle w:val="Heading1"/>
+        <w:numPr>
+          <w:ilvl w:val="0"/>
+          <w:numId w:val="0"/>
+        </w:numPr>
+        <w:spacing w:after="23"/>
+        <w:ind w:left="-5"/>
+      </w:pPr>
+      <w:r>
+        <w:t>13</w:t>
+      </w:r>
+      <w:r>
+        <w:t>.</w:t>
+      </w:r>
+      <w:r>
+        <w:t xml:space="preserve"> </w:t>
+      </w:r>
+      <w:r>
+        <w:t>T</w:t>
+      </w:r>
+      <w:r>
+        <w:t xml:space="preserve">ask Distribution </w:t>
+      </w:r>
+    </w:p>
+    <w:p>
+      <w:pPr>
+        <w:spacing w:after="0" w:line="259" w:lineRule="auto"/>
+        <w:ind w:left="0" w:firstLine="0"/>
+      </w:pPr>
+      <w:r>
+        <w:rPr>
+          <w:b/>
+          <w:sz w:val="32"/>
+        </w:rPr>
+        <w:t xml:space="preserve"> </w:t>
+      </w:r>
+    </w:p>
+    <w:p>
+      <w:pPr>
+        <w:spacing w:after="0" w:line="259" w:lineRule="auto"/>
+        <w:ind w:left="-1082" w:right="-1008" w:firstLine="0"/>
+        <w:rPr>
+          <w:noProof/>
+        </w:rPr>
+      </w:pPr>
+      <w:r>
+        <w:rPr>
+          <w:noProof/>
+        </w:rPr>
+        <w:t xml:space="preserve">   </w:t>
+      </w:r>
+    </w:p>
+    <w:p>
+      <w:pPr>
+        <w:spacing w:after="160" w:line="278" w:lineRule="auto"/>
+        <w:ind w:left="0" w:firstLine="0"/>
+        <w:rPr>
+          <w:noProof/>
+        </w:rPr>
+      </w:pPr>
+      <w:r>
+        <w:rPr>
+          <w:noProof/>
+        </w:rPr>
+        <w:br w:type="page"/>
+      </w:r>
+    </w:p>
+    <w:p>
+      <w:pPr>
+        <w:pStyle w:val="Heading1"/>
+        <w:numPr>
+          <w:ilvl w:val="0"/>
+          <w:numId w:val="0"/>
+        </w:numPr>
+      </w:pPr>
+      <w:r>
+        <w:lastRenderedPageBreak/>
+        <w:t>13.</w:t>
+      </w:r>
+      <w:r>
+        <w:t>Task Distribution</w:t>
+      </w:r>
+    </w:p>
+    <w:p>
+      <w:r>
+        <w:rPr>
+          <w:noProof/>
+        </w:rPr>
+        <w:drawing>
+          <wp:inline distT="0" distB="0" distL="0" distR="0" wp14:anchorId="0891C768" wp14:editId="3FABECD6">
+            <wp:extent cx="6248400" cy="5974080"/>
+            <wp:effectExtent l="0" t="0" r="0" b="7620"/>
+            <wp:docPr id="1392445871" name="Picture 119"/>
+            <wp:cNvGraphicFramePr>
+              <a:graphicFrameLocks xmlns:a="http://schemas.openxmlformats.org/drawingml/2006/main" noChangeAspect="1"/>
+            </wp:cNvGraphicFramePr>
+            <a:graphic xmlns:a="http://schemas.openxmlformats.org/drawingml/2006/main">
+              <a:graphicData uri="http://schemas.openxmlformats.org/drawingml/2006/picture">
+                <pic:pic xmlns:pic="http://schemas.openxmlformats.org/drawingml/2006/picture">
+                  <pic:nvPicPr>
+                    <pic:cNvPr id="1392445871" name="Picture 1392445871"/>
+                    <pic:cNvPicPr/>
+                  </pic:nvPicPr>
+                  <pic:blipFill>
+                    <a:blip r:embed="rId10">
+                      <a:extLst>
+                        <a:ext uri="{28A0092B-C50C-407E-A947-70E740481C1C}">
+                          <a14:useLocalDpi xmlns:a14="http://schemas.microsoft.com/office/drawing/2010/main" val="0"/>
+                        </a:ext>
+                      </a:extLst>
+                    </a:blip>
+                    <a:stretch>
+                      <a:fillRect/>
+                    </a:stretch>
+                  </pic:blipFill>
+                  <pic:spPr>
+                    <a:xfrm>
+                      <a:off x="0" y="0"/>
+                      <a:ext cx="6248400" cy="5974080"/>
                     </a:xfrm>
                     <a:prstGeom prst="rect">
                       <a:avLst/>
@@ -9865,12 +10091,12 @@
       </w:r>
     </w:p>
     <w:sectPr>
-      <w:headerReference w:type="even" r:id="rId9"/>
-      <w:headerReference w:type="default" r:id="rId10"/>
-      <w:footerReference w:type="even" r:id="rId11"/>
-      <w:footerReference w:type="default" r:id="rId12"/>
-      <w:headerReference w:type="first" r:id="rId13"/>
-      <w:footerReference w:type="first" r:id="rId14"/>
+      <w:headerReference w:type="even" r:id="rId11"/>
+      <w:headerReference w:type="default" r:id="rId12"/>
+      <w:footerReference w:type="even" r:id="rId13"/>
+      <w:footerReference w:type="default" r:id="rId14"/>
+      <w:headerReference w:type="first" r:id="rId15"/>
+      <w:footerReference w:type="first" r:id="rId16"/>
       <w:pgSz w:w="11906" w:h="16838"/>
       <w:pgMar w:top="1445" w:right="1368" w:bottom="1484" w:left="1440" w:header="480" w:footer="478" w:gutter="0"/>
       <w:cols w:space="720"/>

</xml_diff>